<commit_message>
fix(templates): the equipment list's note stands once after the sections, never alone on a page
Claude-Session: https://claude.ai/code/session_01F1WgouFMHfd4n13ZWxgG8f
</commit_message>
<xml_diff>
--- a/packages/document-engine/templates/6_protective_equipment_list.docx
+++ b/packages/document-engine/templates/6_protective_equipment_list.docx
@@ -8395,7 +8395,7 @@
           <w:p>
             <w:pPr>
               <w:pStyle w:val="TableHeading"/>
-              <w:keepNext w:val="false"/>
+              <w:keepNext w:val="true"/>
               <w:widowControl/>
               <w:spacing w:before="0" w:after="0"/>
               <w:ind w:hanging="0" w:left="0"/>
@@ -8441,7 +8441,7 @@
           <w:p>
             <w:pPr>
               <w:pStyle w:val="TableHeading"/>
-              <w:keepNext w:val="false"/>
+              <w:keepNext w:val="true"/>
               <w:widowControl/>
               <w:spacing w:before="0" w:after="0"/>
               <w:ind w:hanging="0" w:left="0"/>
@@ -8488,7 +8488,7 @@
           <w:p>
             <w:pPr>
               <w:pStyle w:val="TableHeading"/>
-              <w:keepNext w:val="false"/>
+              <w:keepNext w:val="true"/>
               <w:widowControl/>
               <w:spacing w:before="0" w:after="0"/>
               <w:ind w:hanging="0" w:left="0"/>
@@ -8535,7 +8535,7 @@
           <w:p>
             <w:pPr>
               <w:pStyle w:val="TableContents"/>
-              <w:keepNext w:val="true"/>
+              <w:keepNext w:val="false"/>
               <w:widowControl/>
               <w:spacing w:before="0" w:after="0"/>
               <w:ind w:hanging="0" w:left="0"/>
@@ -8702,55 +8702,6 @@
           </w:p>
         </w:tc>
       </w:tr>
-      <w:tr>
-        <w:trPr/>
-        <w:tc>
-          <w:tcPr>
-            <w:tcW w:w="14287" w:type="dxa"/>
-            <w:gridSpan w:val="4"/>
-            <w:tcBorders>
-              <w:left w:val="single" w:sz="4" w:space="0" w:color="000000"/>
-              <w:bottom w:val="single" w:sz="4" w:space="0" w:color="000000"/>
-              <w:right w:val="single" w:sz="4" w:space="0" w:color="000000"/>
-            </w:tcBorders>
-          </w:tcPr>
-          <w:p>
-            <w:pPr>
-              <w:pStyle w:val="TableContents"/>
-              <w:keepNext w:val="false"/>
-              <w:widowControl/>
-              <w:spacing w:before="0" w:after="0"/>
-              <w:ind w:hanging="0" w:left="0"/>
-              <w:jc w:val="left"/>
-              <w:rPr>
-                <w:rFonts w:ascii="Arial" w:hAnsi="Arial" w:eastAsia="Arial" w:cs="Arial"/>
-                <w:b w:val="false"/>
-                <w:i w:val="false"/>
-                <w:color w:val="auto"/>
-                <w:spacing w:val="0"/>
-                <w:w w:val="100"/>
-                <w:sz w:val="20"/>
-                <w:szCs w:val="20"/>
-                <w:lang w:val="ro-RO"/>
-              </w:rPr>
-            </w:pPr>
-            <w:r>
-              <w:rPr>
-                <w:rFonts w:eastAsia="Arial" w:cs="Arial" w:ascii="Arial" w:hAnsi="Arial"/>
-                <w:b w:val="false"/>
-                <w:i w:val="false"/>
-                <w:color w:val="auto"/>
-                <w:spacing w:val="0"/>
-                <w:w w:val="100"/>
-                <w:sz w:val="20"/>
-                <w:szCs w:val="20"/>
-                <w:lang w:val="ro-RO"/>
-              </w:rPr>
-              <w:t>Observații: La predarea echipamentului individual de protecție se va completa procesul verbal de predare – primire.</w:t>
-            </w:r>
-          </w:p>
-        </w:tc>
-      </w:tr>
     </w:tbl>
     <w:p>
       <w:pPr>
@@ -8778,6 +8729,36 @@
           <w:lang w:val="ro-RO"/>
         </w:rPr>
         <w:t>{{/equippedPositions}}</w:t>
+      </w:r>
+    </w:p>
+    <w:p>
+      <w:pPr>
+        <w:pStyle w:val="Normal"/>
+        <w:keepNext w:val="false"/>
+        <w:widowControl/>
+        <w:spacing w:before="240" w:after="120"/>
+        <w:ind w:hanging="0" w:left="0"/>
+        <w:jc w:val="left"/>
+        <w:rPr>
+          <w:rFonts w:ascii="Arial" w:hAnsi="Arial" w:cs="Arial"/>
+          <w:b w:val="false"/>
+          <w:sz w:val="20"/>
+          <w:szCs w:val="20"/>
+        </w:rPr>
+      </w:pPr>
+      <w:r>
+        <w:rPr>
+          <w:rFonts w:eastAsia="Arial" w:cs="Arial" w:ascii="Arial" w:hAnsi="Arial"/>
+          <w:b w:val="false"/>
+          <w:i w:val="false"/>
+          <w:color w:val="auto"/>
+          <w:spacing w:val="0"/>
+          <w:w w:val="100"/>
+          <w:sz w:val="20"/>
+          <w:szCs w:val="20"/>
+          <w:lang w:val="ro-RO"/>
+        </w:rPr>
+        <w:t>Observații: La predarea echipamentului individual de protecție se va completa procesul verbal de predare – primire.</w:t>
       </w:r>
     </w:p>
     <w:sectPr>

</xml_diff>

<commit_message>
fix(templates): punctuation, "pături" and "proces-verbal" in the protective equipment list
Intro: "Art. 12 alin. (1)", "cerințele Legii 319/ 2006", "Art. 15 alin. (1) punctul 20".
Anexa 2: "„de securitate”", "pături de protecție", "Protecția întregului corp:", point 4's
last item ends with ".". Anexa 3: every group's last item ends with "." and the others with
";", point 7's items start in lower case. Observații: "procesul-verbal de predare-primire".

Claude-Session: https://claude.ai/code/session_01A9qjCHVH6kcDAEKFiJoShR
</commit_message>
<xml_diff>
--- a/packages/document-engine/templates/6_protective_equipment_list.docx
+++ b/packages/document-engine/templates/6_protective_equipment_list.docx
@@ -384,7 +384,7 @@
           <w:szCs w:val="20"/>
           <w:lang w:val="ro-RO"/>
         </w:rPr>
-        <w:t xml:space="preserve"> Art. 12. alin. (1)</w:t>
+        <w:t xml:space="preserve"> Art. 12 alin. (1)</w:t>
       </w:r>
       <w:r>
         <w:rPr>
@@ -494,7 +494,7 @@
           <w:szCs w:val="20"/>
           <w:lang w:val="ro-RO"/>
         </w:rPr>
-        <w:t>Pentru a aduce la îndeplinire cerințele legii 319/ 2006 și cerințele H.G. 1425/ 2006, Art. 15.</w:t>
+        <w:t xml:space="preserve">Pentru a aduce la îndeplinire cerințele Legii 319/ 2006 și cerințele H.G. 1425/ 2006, Art. 15</w:t>
       </w:r>
       <w:r>
         <w:rPr>
@@ -508,7 +508,7 @@
           <w:szCs w:val="20"/>
           <w:lang w:val="ro-RO"/>
         </w:rPr>
-        <w:t xml:space="preserve"> alin, (1) </w:t>
+        <w:t xml:space="preserve"> alin. (1) </w:t>
       </w:r>
       <w:r>
         <w:rPr>
@@ -3827,7 +3827,7 @@
           <w:szCs w:val="20"/>
           <w:lang w:val="ro-RO"/>
         </w:rPr>
-        <w:t xml:space="preserve">aparate de protecție respiratorie cu mască de sudură detașabilă;</w:t>
+        <w:t xml:space="preserve">aparate de protecție respiratorie cu mască de sudură detașabilă.</w:t>
       </w:r>
     </w:p>
     <w:p>
@@ -4955,7 +4955,7 @@
           <w:szCs w:val="20"/>
           <w:lang w:val="ro-RO"/>
         </w:rPr>
-        <w:t>Protecția întregului corp</w:t>
+        <w:t xml:space="preserve">Protecția întregului corp:</w:t>
       </w:r>
     </w:p>
     <w:p>
@@ -5133,7 +5133,7 @@
           <w:szCs w:val="20"/>
           <w:lang w:val="ro-RO"/>
         </w:rPr>
-        <w:t>îmbrăcăminte pentru lucru "de securitate" (două piese și combinezoane);</w:t>
+        <w:t xml:space="preserve">îmbrăcăminte pentru lucru „de securitate” (două piese și combinezoane);</w:t>
       </w:r>
     </w:p>
     <w:p>
@@ -5423,7 +5423,7 @@
           <w:szCs w:val="20"/>
           <w:lang w:val="ro-RO"/>
         </w:rPr>
-        <w:t>paturi de protecție.</w:t>
+        <w:t xml:space="preserve">pături de protecție.</w:t>
       </w:r>
     </w:p>
     <w:p>
@@ -5742,7 +5742,7 @@
           <w:szCs w:val="20"/>
           <w:lang w:val="ro-RO"/>
         </w:rPr>
-        <w:t>lucrări la cuptoare industriale, containere, mașini, silozuri, buncăre și conducte;</w:t>
+        <w:t xml:space="preserve">lucrări la cuptoare industriale, containere, mașini, silozuri, buncăre și conducte.</w:t>
       </w:r>
     </w:p>
     <w:p>
@@ -6250,7 +6250,7 @@
           <w:szCs w:val="20"/>
           <w:lang w:val="ro-RO"/>
         </w:rPr>
-        <w:t>transport și depozitare;</w:t>
+        <w:t xml:space="preserve">transport și depozitare.</w:t>
       </w:r>
     </w:p>
     <w:p>
@@ -6981,7 +6981,7 @@
           <w:szCs w:val="20"/>
           <w:lang w:val="ro-RO"/>
         </w:rPr>
-        <w:t>lucrări în puțuri, canale și alte spații subterane ale sistemului de canalizare;</w:t>
+        <w:t xml:space="preserve">lucrări în puțuri, canale și alte spații subterane ale sistemului de canalizare.</w:t>
       </w:r>
     </w:p>
     <w:p>
@@ -7289,7 +7289,7 @@
           <w:szCs w:val="20"/>
           <w:lang w:val="ro-RO"/>
         </w:rPr>
-        <w:t>lucrări de sablare;</w:t>
+        <w:t xml:space="preserve">lucrări de sablare.</w:t>
       </w:r>
     </w:p>
     <w:p>
@@ -7478,7 +7478,7 @@
           <w:szCs w:val="20"/>
           <w:lang w:val="ro-RO"/>
         </w:rPr>
-        <w:t>lucrări de sudură;</w:t>
+        <w:t xml:space="preserve">lucrări de sudură.</w:t>
       </w:r>
     </w:p>
     <w:p>
@@ -7726,7 +7726,7 @@
           <w:szCs w:val="20"/>
           <w:lang w:val="ro-RO"/>
         </w:rPr>
-        <w:t>lucrări în aer liber pe ploaie și vreme rece.</w:t>
+        <w:t xml:space="preserve">lucrări în aer liber pe ploaie și vreme rece;</w:t>
       </w:r>
     </w:p>
     <w:p>
@@ -7755,7 +7755,7 @@
           <w:szCs w:val="20"/>
           <w:lang w:val="ro-RO"/>
         </w:rPr>
-        <w:t xml:space="preserve">Activități de pază,</w:t>
+        <w:t xml:space="preserve">activități de pază;</w:t>
       </w:r>
     </w:p>
     <w:p>
@@ -7784,7 +7784,7 @@
           <w:szCs w:val="20"/>
           <w:lang w:val="ro-RO"/>
         </w:rPr>
-        <w:t xml:space="preserve">Activități în silvicultură</w:t>
+        <w:t xml:space="preserve">activități în silvicultură;</w:t>
       </w:r>
     </w:p>
     <w:p>
@@ -7813,7 +7813,7 @@
           <w:szCs w:val="20"/>
           <w:lang w:val="ro-RO"/>
         </w:rPr>
-        <w:t>Activități de monitorizare a oleoductelor și gazoductelor</w:t>
+        <w:t xml:space="preserve">activități de monitorizare a oleoductelor și gazoductelor.</w:t>
       </w:r>
     </w:p>
     <w:p>
@@ -7877,7 +7877,7 @@
           <w:szCs w:val="20"/>
           <w:lang w:val="ro-RO"/>
         </w:rPr>
-        <w:t>lucrări în locuri în care lucrătorii trebuie să poată fi observați la timp.</w:t>
+        <w:t xml:space="preserve">lucrări în locuri în care lucrătorii trebuie să poată fi observați la timp;</w:t>
       </w:r>
     </w:p>
     <w:p>
@@ -7906,7 +7906,7 @@
           <w:szCs w:val="20"/>
           <w:lang w:val="ro-RO"/>
         </w:rPr>
-        <w:t xml:space="preserve">lucrări la drumuri și șosele, poduri, căi ferate,</w:t>
+        <w:t xml:space="preserve">lucrări la drumuri și șosele, poduri, căi ferate.</w:t>
       </w:r>
     </w:p>
     <w:p>
@@ -8274,7 +8274,7 @@
           <w:szCs w:val="20"/>
           <w:lang w:val="ro-RO"/>
         </w:rPr>
-        <w:t>prelucrarea materialelor de acoperire;</w:t>
+        <w:t xml:space="preserve">prelucrarea materialelor de acoperire.</w:t>
       </w:r>
     </w:p>
     <w:p>
@@ -8940,7 +8940,7 @@
           <w:szCs w:val="20"/>
           <w:lang w:val="ro-RO"/>
         </w:rPr>
-        <w:t>Observații: La predarea echipamentului individual de protecție se va completa procesul verbal de predare – primire.</w:t>
+        <w:t xml:space="preserve">Observații: La predarea echipamentului individual de protecție se va completa procesul-verbal de predare-primire.</w:t>
       </w:r>
     </w:p>
     <w:sectPr>

</xml_diff>

<commit_message>
fix(documents): the equipment list names the positions when none needs equipment
With no equipped position, 6 printed "Pentru posturile de lucru de mai sus nu
este necesară dotarea cu echipament individual de protecție." after Annex 3,
where "de mai sus" pointed at Annex 3's activities, then the note on handing
equipment over. It now names the positions as the per-position sentence does,
"Pentru postul de lucru X / posturile de lucru X, Y și Z nu este necesară
dotarea cu echipament individual de protecție.", and leaves the "Observații:
La predarea echipamentului…" note out: unequippedPositionsText holds every
position in that case, and hasEquippedPositions guards the note.

Claude-Session: https://claude.ai/code/session_01A9qjCHVH6kcDAEKFiJoShR
</commit_message>
<xml_diff>
--- a/packages/document-engine/templates/6_protective_equipment_list.docx
+++ b/packages/document-engine/templates/6_protective_equipment_list.docx
@@ -8293,87 +8293,6 @@
       <w:r>
         <w:rPr>
           <w:rFonts w:eastAsia="Arial" w:cs="Arial" w:ascii="Arial" w:hAnsi="Arial"/>
-          <w:b w:val="false"/>
-          <w:color w:val="auto"/>
-          <w:spacing w:val="0"/>
-          <w:w w:val="100"/>
-          <w:sz w:val="20"/>
-          <w:szCs w:val="20"/>
-          <w:lang w:val="ro-RO"/>
-        </w:rPr>
-        <w:t xml:space="preserve">{{^equippedPositions}}</w:t>
-      </w:r>
-    </w:p>
-    <w:p>
-      <w:pPr>
-        <w:pStyle w:val="Normal"/>
-        <w:widowControl/>
-        <w:spacing w:before="240" w:after="120"/>
-        <w:ind w:hanging="0"/>
-        <w:jc w:val="left"/>
-        <w:rPr>
-          <w:rFonts w:ascii="Arial" w:hAnsi="Arial" w:cs="Arial"/>
-          <w:sz w:val="20"/>
-          <w:szCs w:val="20"/>
-        </w:rPr>
-      </w:pPr>
-      <w:r>
-        <w:rPr>
-          <w:rFonts w:eastAsia="Arial" w:cs="Arial" w:ascii="Arial" w:hAnsi="Arial"/>
-          <w:b w:val="false"/>
-          <w:color w:val="auto"/>
-          <w:spacing w:val="0"/>
-          <w:w w:val="100"/>
-          <w:sz w:val="20"/>
-          <w:szCs w:val="20"/>
-          <w:lang w:val="ro-RO"/>
-        </w:rPr>
-        <w:t xml:space="preserve">Pentru posturile de lucru de mai sus nu este necesară dotarea cu echipament individual de protecție.</w:t>
-      </w:r>
-    </w:p>
-    <w:p>
-      <w:pPr>
-        <w:pStyle w:val="Normal"/>
-        <w:widowControl/>
-        <w:spacing w:before="0" w:after="120"/>
-        <w:ind w:hanging="0"/>
-        <w:jc w:val="left"/>
-        <w:rPr>
-          <w:rFonts w:ascii="Arial" w:hAnsi="Arial" w:cs="Arial"/>
-          <w:sz w:val="20"/>
-          <w:szCs w:val="20"/>
-        </w:rPr>
-      </w:pPr>
-      <w:r>
-        <w:rPr>
-          <w:rFonts w:eastAsia="Arial" w:cs="Arial" w:ascii="Arial" w:hAnsi="Arial"/>
-          <w:b w:val="false"/>
-          <w:color w:val="auto"/>
-          <w:spacing w:val="0"/>
-          <w:w w:val="100"/>
-          <w:sz w:val="20"/>
-          <w:szCs w:val="20"/>
-          <w:lang w:val="ro-RO"/>
-        </w:rPr>
-        <w:t xml:space="preserve">{{/equippedPositions}}</w:t>
-      </w:r>
-    </w:p>
-    <w:p>
-      <w:pPr>
-        <w:pStyle w:val="Normal"/>
-        <w:widowControl/>
-        <w:spacing w:before="0" w:after="120"/>
-        <w:ind w:hanging="0"/>
-        <w:jc w:val="left"/>
-        <w:rPr>
-          <w:rFonts w:ascii="Arial" w:hAnsi="Arial" w:cs="Arial"/>
-          <w:sz w:val="20"/>
-          <w:szCs w:val="20"/>
-        </w:rPr>
-      </w:pPr>
-      <w:r>
-        <w:rPr>
-          <w:rFonts w:eastAsia="Arial" w:cs="Arial" w:ascii="Arial" w:hAnsi="Arial"/>
           <w:color w:val="auto"/>
           <w:spacing w:val="0"/>
           <w:w w:val="100"/>
@@ -8916,6 +8835,33 @@
     <w:p>
       <w:pPr>
         <w:pStyle w:val="Normal"/>
+        <w:widowControl/>
+        <w:spacing w:before="0" w:after="120"/>
+        <w:ind w:hanging="0"/>
+        <w:jc w:val="left"/>
+        <w:rPr>
+          <w:rFonts w:ascii="Arial" w:hAnsi="Arial" w:cs="Arial"/>
+          <w:sz w:val="20"/>
+          <w:szCs w:val="20"/>
+        </w:rPr>
+      </w:pPr>
+      <w:r>
+        <w:rPr>
+          <w:rFonts w:eastAsia="Arial" w:cs="Arial" w:ascii="Arial" w:hAnsi="Arial"/>
+          <w:b w:val="false"/>
+          <w:color w:val="auto"/>
+          <w:spacing w:val="0"/>
+          <w:w w:val="100"/>
+          <w:sz w:val="20"/>
+          <w:szCs w:val="20"/>
+          <w:lang w:val="ro-RO"/>
+        </w:rPr>
+        <w:t xml:space="preserve">{{#hasEquippedPositions}}</w:t>
+      </w:r>
+    </w:p>
+    <w:p>
+      <w:pPr>
+        <w:pStyle w:val="Normal"/>
         <w:keepNext w:val="false"/>
         <w:widowControl/>
         <w:spacing w:before="240" w:after="120"/>
@@ -8941,6 +8887,33 @@
           <w:lang w:val="ro-RO"/>
         </w:rPr>
         <w:t xml:space="preserve">Observații: La predarea echipamentului individual de protecție se va completa procesul-verbal de predare-primire.</w:t>
+      </w:r>
+    </w:p>
+    <w:p>
+      <w:pPr>
+        <w:pStyle w:val="Normal"/>
+        <w:widowControl/>
+        <w:spacing w:before="0" w:after="120"/>
+        <w:ind w:hanging="0"/>
+        <w:jc w:val="left"/>
+        <w:rPr>
+          <w:rFonts w:ascii="Arial" w:hAnsi="Arial" w:cs="Arial"/>
+          <w:sz w:val="20"/>
+          <w:szCs w:val="20"/>
+        </w:rPr>
+      </w:pPr>
+      <w:r>
+        <w:rPr>
+          <w:rFonts w:eastAsia="Arial" w:cs="Arial" w:ascii="Arial" w:hAnsi="Arial"/>
+          <w:b w:val="false"/>
+          <w:color w:val="auto"/>
+          <w:spacing w:val="0"/>
+          <w:w w:val="100"/>
+          <w:sz w:val="20"/>
+          <w:szCs w:val="20"/>
+          <w:lang w:val="ro-RO"/>
+        </w:rPr>
+        <w:t xml:space="preserve">{{/hasEquippedPositions}}</w:t>
       </w:r>
     </w:p>
     <w:sectPr>

</xml_diff>

<commit_message>
fix(documents): 6 spaces its slashes as the rest of the document does
14 slashes in the quoted H.G. 1048 take the house form "x/ y": the act
numbers (1048/ 09.08.2006, 319/ 2006 x3, 115/ 2004), "și/ sau" x5,
"riscul/ riscurile respectiv/ respective" and two lines of Anexa 2.
Spacing only; the wording of the quotation is unchanged.

Claude-Session: https://claude.ai/code/session_01A9qjCHVH6kcDAEKFiJoShR
</commit_message>
<xml_diff>
--- a/packages/document-engine/templates/6_protective_equipment_list.docx
+++ b/packages/document-engine/templates/6_protective_equipment_list.docx
@@ -1159,7 +1159,7 @@
           <w:szCs w:val="20"/>
           <w:lang w:val="ro-RO"/>
         </w:rPr>
-        <w:t>Hotărârea 1048/09.08.2006 stabilește cerințele minime referitoare la echipamentul individual de protecție utilizat de lucrători la locul de muncă.</w:t>
+        <w:t xml:space="preserve">Hotărârea 1048/ 09.08.2006 stabilește cerințele minime referitoare la echipamentul individual de protecție utilizat de lucrători la locul de muncă.</w:t>
       </w:r>
     </w:p>
     <w:p>
@@ -1193,7 +1193,7 @@
           <w:szCs w:val="20"/>
           <w:lang w:val="ro-RO"/>
         </w:rPr>
-        <w:t>Prevederile Legii securității și sănătății în muncă nr. 319/2006 se aplică în totalitate domeniului menționat la art. 1, fără a aduce atingere dispozițiilor mai restrictive și/sau specifice cuprinse în prezenta hotărâre.</w:t>
+        <w:t xml:space="preserve">Prevederile Legii securității și sănătății în muncă nr. 319/ 2006 se aplică în totalitate domeniului menționat la art. 1, fără a aduce atingere dispozițiilor mai restrictive și/ sau specifice cuprinse în prezenta hotărâre.</w:t>
       </w:r>
     </w:p>
     <w:p>
@@ -1564,7 +1564,7 @@
           <w:szCs w:val="20"/>
           <w:lang w:val="ro-RO"/>
         </w:rPr>
-        <w:t xml:space="preserve">(1) Echipamentul individual de protecție trebuie să respecte prevederile Hotărârii Guvernului nr. 115/2004 privind stabilirea cerințelor esențiale de securitate ale echipamentelor individuale de protecție și a condițiilor pentru introducerea lor pe piață, cu modificările ulterioare.</w:t>
+        <w:t xml:space="preserve">(1) Echipamentul individual de protecție trebuie să respecte prevederile Hotărârii Guvernului nr. 115/ 2004 privind stabilirea cerințelor esențiale de securitate ale echipamentelor individuale de protecție și a condițiilor pentru introducerea lor pe piață, cu modificările ulterioare.</w:t>
       </w:r>
     </w:p>
     <w:p>
@@ -1745,7 +1745,7 @@
           <w:szCs w:val="20"/>
           <w:lang w:val="ro-RO"/>
         </w:rPr>
-        <w:t xml:space="preserve">În cazul în care prezența unor riscuri multiple impune purtarea simultană a mai multor echipamente individuale de protecție, aceste echipamente trebuie să fie compatibile și să își păstreze eficacitatea în raport cu riscul/riscurile respectiv/respective.</w:t>
+        <w:t xml:space="preserve">În cazul în care prezența unor riscuri multiple impune purtarea simultană a mai multor echipamente individuale de protecție, aceste echipamente trebuie să fie compatibile și să își păstreze eficacitatea în raport cu riscul/ riscurile respectiv/ respective.</w:t>
       </w:r>
     </w:p>
     <w:p>
@@ -1876,7 +1876,7 @@
           <w:szCs w:val="20"/>
           <w:lang w:val="ro-RO"/>
         </w:rPr>
-        <w:t>În cadrul întreprinderii și/sau unității trebuie să se furnizeze și să fie disponibile informații adecvate privind fiecare echipament individual de protecție impus în conformitate cu art. 5 și 6.</w:t>
+        <w:t xml:space="preserve">În cadrul întreprinderii și/ sau unității trebuie să se furnizeze și să fie disponibile informații adecvate privind fiecare echipament individual de protecție impus în conformitate cu art. 5 și 6.</w:t>
       </w:r>
     </w:p>
     <w:p>
@@ -2355,7 +2355,7 @@
           <w:szCs w:val="20"/>
           <w:lang w:val="ro-RO"/>
         </w:rPr>
-        <w:t xml:space="preserve">(1) Fără a aduce atingere prevederilor art. 6-16, Ministerul Muncii, Solidarității Sociale și Familiei stabilește reguli generale pentru utilizarea echipamentului individual de protecție și/sau reguli care reglementează cazurile și situațiile în care angajatorul trebuie să furnizeze echipamentul individual de protecție, luând în considerare reglementările tehnice române care transpun legislația comunitară privind libera circulație a acestui echipament.</w:t>
+        <w:t xml:space="preserve">(1) Fără a aduce atingere prevederilor art. 6-16, Ministerul Muncii, Solidarității Sociale și Familiei stabilește reguli generale pentru utilizarea echipamentului individual de protecție și/ sau reguli care reglementează cazurile și situațiile în care angajatorul trebuie să furnizeze echipamentul individual de protecție, luând în considerare reglementările tehnice române care transpun legislația comunitară privind libera circulație a acestui echipament.</w:t>
       </w:r>
     </w:p>
     <w:p>
@@ -2558,7 +2558,7 @@
           <w:szCs w:val="20"/>
           <w:lang w:val="ro-RO"/>
         </w:rPr>
-        <w:t xml:space="preserve">Fără a aduce atingere prevederilor art. 16 din Legea securității și sănătății în muncă nr. 319/2006, lucrătorii și/sau reprezentanții acestora sunt informați cu privire la toate măsurile ce trebuie luate în domeniul securității și sănătății lucrătorilor, atunci când aceștia utilizează echipamente individuale de protecție la locul de muncă.</w:t>
+        <w:t xml:space="preserve">Fără a aduce atingere prevederilor art. 16 din Legea securității și sănătății în muncă nr. 319/ 2006, lucrătorii și/ sau reprezentanții acestora sunt informați cu privire la toate măsurile ce trebuie luate în domeniul securității și sănătății lucrătorilor, atunci când aceștia utilizează echipamente individuale de protecție la locul de muncă.</w:t>
       </w:r>
     </w:p>
     <w:p>
@@ -2604,7 +2604,7 @@
           <w:szCs w:val="20"/>
           <w:lang w:val="ro-RO"/>
         </w:rPr>
-        <w:t xml:space="preserve">Consultarea și participarea lucrătorilor și/sau a reprezentanților acestora cu privire la problemele la care se face referire în acest document, inclusiv în anexele acestuia, se desfășoară în conformitate cu prevederile art. 18 din Legea nr. 319/2006.</w:t>
+        <w:t xml:space="preserve">Consultarea și participarea lucrătorilor și/ sau a reprezentanților acestora cu privire la problemele la care se face referire în acest document, inclusiv în anexele acestuia, se desfășoară în conformitate cu prevederile art. 18 din Legea nr. 319/ 2006.</w:t>
       </w:r>
     </w:p>
     <w:p>
@@ -4713,7 +4713,7 @@
           <w:szCs w:val="20"/>
           <w:lang w:val="ro-RO"/>
         </w:rPr>
-        <w:t>creme de protecție/unguente.</w:t>
+        <w:t xml:space="preserve">creme de protecție/ unguente.</w:t>
       </w:r>
     </w:p>
     <w:p>
@@ -6894,7 +6894,7 @@
           <w:szCs w:val="20"/>
           <w:lang w:val="ro-RO"/>
         </w:rPr>
-        <w:t>Semimăști/Aparate de protecție respiratorie:</w:t>
+        <w:t xml:space="preserve">Semimăști/ Aparate de protecție respiratorie:</w:t>
       </w:r>
     </w:p>
     <w:p>

</xml_diff>